<commit_message>
Wavicide containers are 4 L: add liters and price per liter
Co-Authored-By: Claude Opus 5.5 <noreply@anthropic.com>
Claude-Session: https://claude.ai/code/session_01B8cvFTSdQSKjtYf5gAi3Q4
</commit_message>
<xml_diff>
--- a/reports/1405-07-26_نامه-ویوساید-کنترل-عفونت.docx
+++ b/reports/1405-07-26_نامه-ویوساید-کنترل-عفونت.docx
@@ -156,7 +156,7 @@
         <w:rPr>
           <w:rtl/>
         </w:rPr>
-        <w:t xml:space="preserve">سومین قلم پرهزینه استوک بخش‌ها بوده است. این مبلغ ۱۱٪ کل ارزش استوک است. قیمت خرید هر ظرف از ۵۸٫۵ میلیون ریال در اردیبهشت به ۱۳۸ میلیون ریال در خرداد رسیده است (۲٫۴ برابر).</w:t>
+        <w:t xml:space="preserve">سومین قلم پرهزینه استوک بخش‌ها بوده است. این مبلغ ۱۱٪ کل ارزش استوک است. قیمت خرید هر ظرف ۴ لیتری از ۵۸٫۵ میلیون ریال در اردیبهشت به ۱۳۸ میلیون ریال در خرداد رسیده است (۲٫۴ برابر)؛ یعنی هر لیتر ۳۴٫۵ میلیون ریال.</w:t>
       </w:r>
     </w:p>
     <w:tbl>
@@ -167,14 +167,15 @@
         <w:jc w:val="start"/>
       </w:tblPr>
       <w:tblGrid>
-        <w:gridCol w:w="990"/>
-        <w:gridCol w:w="990"/>
-        <w:gridCol w:w="990"/>
-        <w:gridCol w:w="990"/>
-        <w:gridCol w:w="990"/>
-        <w:gridCol w:w="990"/>
-        <w:gridCol w:w="990"/>
-        <w:gridCol w:w="990"/>
+        <w:gridCol w:w="879"/>
+        <w:gridCol w:w="879"/>
+        <w:gridCol w:w="879"/>
+        <w:gridCol w:w="879"/>
+        <w:gridCol w:w="879"/>
+        <w:gridCol w:w="879"/>
+        <w:gridCol w:w="879"/>
+        <w:gridCol w:w="879"/>
+        <w:gridCol w:w="879"/>
       </w:tblGrid>
       <w:tr>
         <w:trPr>
@@ -288,7 +289,23 @@
               <w:rPr>
                 <w:rtl/>
               </w:rPr>
-              <w:t xml:space="preserve">جمع (ظرف)</w:t>
+              <w:t xml:space="preserve">جمع (ظرف ۴ لیتری)</w:t>
+            </w:r>
+          </w:p>
+        </w:tc>
+        <w:tc>
+          <w:tcPr/>
+          <w:p>
+            <w:pPr>
+              <w:pStyle w:val="Compact"/>
+              <w:bidi/>
+              <w:jc w:val="left"/>
+            </w:pPr>
+            <w:r>
+              <w:rPr>
+                <w:rtl/>
+              </w:rPr>
+              <w:t xml:space="preserve">لیتر</w:t>
             </w:r>
           </w:p>
         </w:tc>
@@ -434,6 +451,22 @@
               <w:rPr>
                 <w:rtl/>
               </w:rPr>
+              <w:t xml:space="preserve">۳۰۸</w:t>
+            </w:r>
+          </w:p>
+        </w:tc>
+        <w:tc>
+          <w:tcPr/>
+          <w:p>
+            <w:pPr>
+              <w:pStyle w:val="Compact"/>
+              <w:bidi/>
+              <w:jc w:val="left"/>
+            </w:pPr>
+            <w:r>
+              <w:rPr>
+                <w:rtl/>
+              </w:rPr>
               <w:t xml:space="preserve">۱۰٫۶</w:t>
             </w:r>
           </w:p>
@@ -564,6 +597,22 @@
               <w:rPr>
                 <w:rtl/>
               </w:rPr>
+              <w:t xml:space="preserve">۲۲۸</w:t>
+            </w:r>
+          </w:p>
+        </w:tc>
+        <w:tc>
+          <w:tcPr/>
+          <w:p>
+            <w:pPr>
+              <w:pStyle w:val="Compact"/>
+              <w:bidi/>
+              <w:jc w:val="left"/>
+            </w:pPr>
+            <w:r>
+              <w:rPr>
+                <w:rtl/>
+              </w:rPr>
               <w:t xml:space="preserve">۶٫۷</w:t>
             </w:r>
           </w:p>
@@ -679,6 +728,22 @@
                 <w:rtl/>
               </w:rPr>
               <w:t xml:space="preserve">۳</w:t>
+            </w:r>
+          </w:p>
+        </w:tc>
+        <w:tc>
+          <w:tcPr/>
+          <w:p>
+            <w:pPr>
+              <w:pStyle w:val="Compact"/>
+              <w:bidi/>
+              <w:jc w:val="left"/>
+            </w:pPr>
+            <w:r>
+              <w:rPr>
+                <w:rtl/>
+              </w:rPr>
+              <w:t xml:space="preserve">۱۲</w:t>
             </w:r>
           </w:p>
         </w:tc>
@@ -732,7 +797,7 @@
         <w:rPr>
           <w:rtl/>
         </w:rPr>
-        <w:t xml:space="preserve">، در حالی که ضدعفونی سطح بالا معمولاً برای آندوسکوپ‌های انعطاف‌پذیر و ابزار حساس به حرارت به کار می‌رود. در خرداد به‌تنهایی ۳۷ ظرف به اتاق عمل حواله شده است.</w:t>
+        <w:t xml:space="preserve">، در حالی که ضدعفونی سطح بالا معمولاً برای آندوسکوپ‌های انعطاف‌پذیر و ابزار حساس به حرارت به کار می‌رود. در خرداد به‌تنهایی ۳۷ ظرف (۱۴۸ لیتر) به اتاق عمل حواله شده است.</w:t>
       </w:r>
     </w:p>
     <w:p>
@@ -780,7 +845,7 @@
           <w:bCs/>
           <w:b/>
         </w:rPr>
-        <w:t xml:space="preserve">تعداد ظرف مصرفی به تعداد ظرف غوطه‌وری و دوره تعویض محلول بستگی دارد.</w:t>
+        <w:t xml:space="preserve">مصرف به تعداد و حجم ظرف غوطه‌وری و دوره تعویض محلول بستگی دارد.</w:t>
       </w:r>
       <w:r>
         <w:rPr>
@@ -792,7 +857,7 @@
         <w:rPr>
           <w:rtl/>
         </w:rPr>
-        <w:t xml:space="preserve">این اطلاعات در دسترس این واحد نیست.</w:t>
+        <w:t xml:space="preserve">آندوسکوپی ماهانه حدود ۶۰ لیتر گرفته است. اگر محلول طبق IFU تا ۳۰ روز استفاده شود، این حجم یعنی چند ظرف غوطه‌وری هم‌زمان یا تعویض زودتر از موعد؛ این اطلاعات در دسترس این واحد نیست.</w:t>
       </w:r>
     </w:p>
     <w:bookmarkStart w:id="20" w:name="درخواست"/>
@@ -1197,7 +1262,7 @@
         <w:rPr>
           <w:rtl/>
         </w:rPr>
-        <w:t xml:space="preserve">منبع: گزارش‌های ماهانه اقلام بخش‌ها (استوک)، فروردین تا شهریور ۱۴۰۵، سامانه HIS (طراح داده / پیشرو). حجم هر ظرف در گزارش HIS مشخص نیست و باید از انبار تأیید شود.</w:t>
+        <w:t xml:space="preserve">منبع: گزارش‌های ماهانه اقلام بخش‌ها (استوک)، فروردین تا شهریور ۱۴۰۵، سامانه HIS (طراح داده / پیشرو). هر ظرف ۴ لیتری است.</w:t>
       </w:r>
     </w:p>
     <w:bookmarkEnd w:id="21"/>

</xml_diff>